<commit_message>
Corrige acentuação dos documentos finais
</commit_message>
<xml_diff>
--- a/documentacao/Entrega_1_Modelagem_Sistema_Entrada_Saida_Veiculos.docx
+++ b/documentacao/Entrega_1_Modelagem_Sistema_Entrada_Saida_Veiculos.docx
@@ -14,7 +14,7 @@
           <w:b/>
           <w:sz w:val="24"/>
         </w:rPr>
-        <w:t>UNIVERSIDADE DO OESTE DE SANTA CATARINA - UNOESC</w:t>
+        <w:t>UNIVERSIDADE DO OESTE DE SANTA CATARINA – UNOESC</w:t>
       </w:r>
     </w:p>
     <w:p>
@@ -27,7 +27,7 @@
           <w:b/>
           <w:sz w:val="24"/>
         </w:rPr>
-        <w:t>CURSO DE AN?LISE E DESENVOLVIMENTO DE SISTEMAS</w:t>
+        <w:t>CURSO DE ANÁLISE E DESENVOLVIMENTO DE SISTEMAS</w:t>
       </w:r>
     </w:p>
     <w:p/>
@@ -63,7 +63,7 @@
           <w:b/>
           <w:sz w:val="24"/>
         </w:rPr>
-        <w:t>MODELAGEM DE UM SISTEMA DE ENTRADA E SA?DA DE VE?CULOS</w:t>
+        <w:t>MODELAGEM DE UM SISTEMA DE ENTRADA E SAÍDA DE VEÍCULOS</w:t>
       </w:r>
     </w:p>
     <w:p/>
@@ -84,7 +84,7 @@
           <w:b w:val="0"/>
           <w:sz w:val="24"/>
         </w:rPr>
-        <w:t>Maravilha - SC</w:t>
+        <w:t>Maravilha – SC</w:t>
       </w:r>
     </w:p>
     <w:p>
@@ -135,7 +135,7 @@
           <w:b/>
           <w:sz w:val="24"/>
         </w:rPr>
-        <w:t>MODELAGEM DE UM SISTEMA DE ENTRADA E SA?DA DE VE?CULOS</w:t>
+        <w:t>MODELAGEM DE UM SISTEMA DE ENTRADA E SAÍDA DE VEÍCULOS</w:t>
       </w:r>
     </w:p>
     <w:p/>
@@ -150,9 +150,10 @@
       <w:r>
         <w:rPr>
           <w:rFonts w:ascii="Times New Roman" w:hAnsi="Times New Roman" w:eastAsia="Times New Roman"/>
+          <w:b w:val="0"/>
           <w:sz w:val="24"/>
         </w:rPr>
-        <w:t>Trabalho acad?mico apresentado ? disciplina de Pr?ticas Extensionistas III, do Curso de An?lise e Desenvolvimento de Sistemas da Universidade do Oeste de Santa Catarina - UNOESC, como requisito parcial de avalia??o.</w:t>
+        <w:t>Trabalho acadêmico apresentado à disciplina de Práticas Extensionistas III, do Curso de Análise e Desenvolvimento de Sistemas da Universidade do Oeste de Santa Catarina – UNOESC, como requisito parcial de avaliação.</w:t>
         <w:br/>
         <w:br/>
         <w:t>Professor: Jean Carlos Hennrichs.</w:t>
@@ -173,7 +174,7 @@
           <w:b w:val="0"/>
           <w:sz w:val="24"/>
         </w:rPr>
-        <w:t>Maravilha - SC</w:t>
+        <w:t>Maravilha – SC</w:t>
       </w:r>
     </w:p>
     <w:p>
@@ -205,22 +206,24 @@
           <w:b/>
           <w:sz w:val="24"/>
         </w:rPr>
-        <w:t>SUM?RIO</w:t>
+        <w:t>SUMÁRIO</w:t>
       </w:r>
     </w:p>
     <w:p>
       <w:r>
         <w:rPr>
           <w:rFonts w:ascii="Times New Roman" w:hAnsi="Times New Roman" w:eastAsia="Times New Roman"/>
+          <w:b w:val="0"/>
           <w:sz w:val="24"/>
         </w:rPr>
-        <w:t>1 INTRODU??O 2</w:t>
+        <w:t>1 INTRODUÇÃO 2</w:t>
       </w:r>
     </w:p>
     <w:p>
       <w:r>
         <w:rPr>
           <w:rFonts w:ascii="Times New Roman" w:hAnsi="Times New Roman" w:eastAsia="Times New Roman"/>
+          <w:b w:val="0"/>
           <w:sz w:val="24"/>
         </w:rPr>
         <w:t>2 MODELAGEM DO BANCO DE DADOS 3</w:t>
@@ -230,6 +233,7 @@
       <w:r>
         <w:rPr>
           <w:rFonts w:ascii="Times New Roman" w:hAnsi="Times New Roman" w:eastAsia="Times New Roman"/>
+          <w:b w:val="0"/>
           <w:sz w:val="24"/>
         </w:rPr>
         <w:t>2.1 Modelo entidade-relacionamento conceitual 4</w:t>
@@ -239,15 +243,17 @@
       <w:r>
         <w:rPr>
           <w:rFonts w:ascii="Times New Roman" w:hAnsi="Times New Roman" w:eastAsia="Times New Roman"/>
+          <w:b w:val="0"/>
           <w:sz w:val="24"/>
         </w:rPr>
-        <w:t>2.2 Modelo entidade-relacionamento l?gico 5</w:t>
+        <w:t>2.2 Modelo entidade-relacionamento lógico 5</w:t>
       </w:r>
     </w:p>
     <w:p>
       <w:r>
         <w:rPr>
           <w:rFonts w:ascii="Times New Roman" w:hAnsi="Times New Roman" w:eastAsia="Times New Roman"/>
+          <w:b w:val="0"/>
           <w:sz w:val="24"/>
         </w:rPr>
         <w:t>3 MODELAGEM DO SISTEMA EM UML 6</w:t>
@@ -257,6 +263,7 @@
       <w:r>
         <w:rPr>
           <w:rFonts w:ascii="Times New Roman" w:hAnsi="Times New Roman" w:eastAsia="Times New Roman"/>
+          <w:b w:val="0"/>
           <w:sz w:val="24"/>
         </w:rPr>
         <w:t>3.1 Diagrama de classes 7</w:t>
@@ -266,6 +273,7 @@
       <w:r>
         <w:rPr>
           <w:rFonts w:ascii="Times New Roman" w:hAnsi="Times New Roman" w:eastAsia="Times New Roman"/>
+          <w:b w:val="0"/>
           <w:sz w:val="24"/>
         </w:rPr>
         <w:t>3.2 Diagrama de caso de uso geral 8</w:t>
@@ -275,15 +283,17 @@
       <w:r>
         <w:rPr>
           <w:rFonts w:ascii="Times New Roman" w:hAnsi="Times New Roman" w:eastAsia="Times New Roman"/>
+          <w:b w:val="0"/>
           <w:sz w:val="24"/>
         </w:rPr>
-        <w:t>3.3 Diagrama de sequ?ncia do registro de entrada 9</w:t>
+        <w:t>3.3 Diagrama de sequência do registro de entrada 9</w:t>
       </w:r>
     </w:p>
     <w:p>
       <w:r>
         <w:rPr>
           <w:rFonts w:ascii="Times New Roman" w:hAnsi="Times New Roman" w:eastAsia="Times New Roman"/>
+          <w:b w:val="0"/>
           <w:sz w:val="24"/>
         </w:rPr>
         <w:t>3.4 Diagrama de atividades do login 10</w:t>
@@ -293,6 +303,7 @@
       <w:r>
         <w:rPr>
           <w:rFonts w:ascii="Times New Roman" w:hAnsi="Times New Roman" w:eastAsia="Times New Roman"/>
+          <w:b w:val="0"/>
           <w:sz w:val="24"/>
         </w:rPr>
         <w:t>3.5 Diagrama de atividades do registro de entrada 11</w:t>
@@ -302,27 +313,30 @@
       <w:r>
         <w:rPr>
           <w:rFonts w:ascii="Times New Roman" w:hAnsi="Times New Roman" w:eastAsia="Times New Roman"/>
+          <w:b w:val="0"/>
           <w:sz w:val="24"/>
         </w:rPr>
-        <w:t>3.6 Diagrama de atividades do registro de sa?da 12</w:t>
+        <w:t>3.6 Diagrama de atividades do registro de saída 12</w:t>
       </w:r>
     </w:p>
     <w:p>
       <w:r>
         <w:rPr>
           <w:rFonts w:ascii="Times New Roman" w:hAnsi="Times New Roman" w:eastAsia="Times New Roman"/>
+          <w:b w:val="0"/>
           <w:sz w:val="24"/>
         </w:rPr>
-        <w:t>4 REPOSIT?RIO DO PROJETO NO GITHUB 13</w:t>
+        <w:t>4 REPOSITÓRIO DO PROJETO NO GITHUB 13</w:t>
       </w:r>
     </w:p>
     <w:p>
       <w:r>
         <w:rPr>
           <w:rFonts w:ascii="Times New Roman" w:hAnsi="Times New Roman" w:eastAsia="Times New Roman"/>
+          <w:b w:val="0"/>
           <w:sz w:val="24"/>
         </w:rPr>
-        <w:t>5 CONSIDERA??ES FINAIS 13</w:t>
+        <w:t>5 CONSIDERAÇÕES FINAIS 13</w:t>
       </w:r>
     </w:p>
     <w:p>
@@ -341,7 +355,7 @@
           <w:b/>
           <w:sz w:val="24"/>
         </w:rPr>
-        <w:t>1 INTRODU??O</w:t>
+        <w:t>1 INTRODUÇÃO</w:t>
       </w:r>
     </w:p>
     <w:p>
@@ -353,23 +367,10 @@
       <w:r>
         <w:rPr>
           <w:rFonts w:ascii="Times New Roman" w:hAnsi="Times New Roman" w:eastAsia="Times New Roman"/>
+          <w:b w:val="0"/>
           <w:sz w:val="24"/>
         </w:rPr>
-        <w:t>Este trabalho apresenta a modelagem estrutural de um sistema de entrada e sa?da de ve?culos proposto para apoiar o controle de acesso em estacionamentos, condom?nios, empresas ou institui??es. A solu??o foi concebida para registrar entradas e sa?das, identificar ve?culos e condutores, controlar usu?rios do sistema e disponibilizar consultas operacionais para acompanhamento da movimenta??o.</w:t>
-      </w:r>
-    </w:p>
-    <w:p>
-      <w:pPr>
-        <w:spacing w:line="360" w:lineRule="auto"/>
-        <w:ind w:firstLine="709"/>
-        <w:jc w:val="both"/>
-      </w:pPr>
-      <w:r>
-        <w:rPr>
-          <w:rFonts w:ascii="Times New Roman" w:hAnsi="Times New Roman" w:eastAsia="Times New Roman"/>
-          <w:sz w:val="24"/>
-        </w:rPr>
-        <w:t>Na primeira etapa do projeto, foram elaborados os principais modelos de an?lise e projeto, contemplando a modelagem do banco de dados e os diagramas UML necess?rios para representar a estrutura e o funcionamento da solu??o computacional. Os diagramas apresentados a seguir servem como base para o desenvolvimento do prot?tipo funcional em PHP 8 com MySQL.</w:t>
+        <w:t>Este trabalho apresenta a modelagem estrutural de um sistema de entrada e saída de veículos proposto para apoiar o controle de acesso em estacionamentos, condomínios, empresas ou instituições. A solução foi concebida para registrar entradas e saídas, identificar veículos e condutores, controlar usuários do sistema e disponibilizar consultas operacionais para acompanhamento da movimentação. Na primeira etapa do projeto, foram elaborados os principais modelos de análise e projeto, contemplando a modelagem do banco de dados e os diagramas UML necessários para representar a estrutura e o funcionamento da solução computacional. Os diagramas apresentados a seguir servem como base para o desenvolvimento do protótipo funcional em PHP 8 com MySQL.</w:t>
       </w:r>
     </w:p>
     <w:p>
@@ -400,9 +401,10 @@
       <w:r>
         <w:rPr>
           <w:rFonts w:ascii="Times New Roman" w:hAnsi="Times New Roman" w:eastAsia="Times New Roman"/>
+          <w:b w:val="0"/>
           <w:sz w:val="24"/>
         </w:rPr>
-        <w:t>A modelagem do banco de dados foi organizada em dois n?veis complementares. O modelo conceitual representa as entidades de neg?cio e seus relacionamentos, enquanto o modelo l?gico detalha os atributos, chaves prim?rias e chaves estrangeiras necess?rios para a implementa??o em um sistema gerenciador de banco de dados relacional.</w:t>
+        <w:t>A modelagem do banco de dados foi organizada em dois níveis complementares. O modelo conceitual representa as entidades de negócio e seus relacionamentos, enquanto o modelo lógico detalha os atributos, chaves primárias e chaves estrangeiras necessários para a implementação em um sistema gerenciador de banco de dados relacional.</w:t>
       </w:r>
     </w:p>
     <w:p>
@@ -433,9 +435,10 @@
       <w:r>
         <w:rPr>
           <w:rFonts w:ascii="Times New Roman" w:hAnsi="Times New Roman" w:eastAsia="Times New Roman"/>
+          <w:b w:val="0"/>
           <w:sz w:val="24"/>
         </w:rPr>
-        <w:t>O modelo conceitual apresenta as principais entidades envolvidas no dom?nio do problema e os relacionamentos entre elas, sem detalhar aspectos f?sicos de implementa??o.</w:t>
+        <w:t>O modelo conceitual apresenta as principais entidades envolvidas no domínio do problema e os relacionamentos entre elas, sem detalhar aspectos físicos de implementação.</w:t>
       </w:r>
     </w:p>
     <w:p>
@@ -446,9 +449,10 @@
       <w:r>
         <w:rPr>
           <w:rFonts w:ascii="Times New Roman" w:hAnsi="Times New Roman" w:eastAsia="Times New Roman"/>
+          <w:b w:val="0"/>
           <w:sz w:val="20"/>
         </w:rPr>
-        <w:t>Figura 1 - Modelo entidade-relacionamento conceitual do sistema</w:t>
+        <w:t>Figura 1 – Modelo entidade-relacionamento conceitual do sistema</w:t>
       </w:r>
     </w:p>
     <w:p>
@@ -498,6 +502,7 @@
       <w:r>
         <w:rPr>
           <w:rFonts w:ascii="Times New Roman" w:hAnsi="Times New Roman" w:eastAsia="Times New Roman"/>
+          <w:b w:val="0"/>
           <w:sz w:val="20"/>
         </w:rPr>
         <w:t>Fonte: elaborado pelo autor (2026).</w:t>
@@ -519,7 +524,7 @@
           <w:b/>
           <w:sz w:val="24"/>
         </w:rPr>
-        <w:t>2.2 Modelo entidade-relacionamento l?gico</w:t>
+        <w:t>2.2 Modelo entidade-relacionamento lógico</w:t>
       </w:r>
     </w:p>
     <w:p>
@@ -531,9 +536,10 @@
       <w:r>
         <w:rPr>
           <w:rFonts w:ascii="Times New Roman" w:hAnsi="Times New Roman" w:eastAsia="Times New Roman"/>
+          <w:b w:val="0"/>
           <w:sz w:val="24"/>
         </w:rPr>
-        <w:t>O modelo l?gico traduz a estrutura conceitual em tabelas, atributos e relacionamentos adequados para a implementa??o do banco de dados relacional.</w:t>
+        <w:t>O modelo lógico traduz a estrutura conceitual em tabelas, atributos e relacionamentos adequados para a implementação do banco de dados relacional.</w:t>
       </w:r>
     </w:p>
     <w:p>
@@ -544,9 +550,10 @@
       <w:r>
         <w:rPr>
           <w:rFonts w:ascii="Times New Roman" w:hAnsi="Times New Roman" w:eastAsia="Times New Roman"/>
+          <w:b w:val="0"/>
           <w:sz w:val="20"/>
         </w:rPr>
-        <w:t>Figura 2 - Modelo entidade-relacionamento l?gico do sistema</w:t>
+        <w:t>Figura 2 – Modelo entidade-relacionamento lógico do sistema</w:t>
       </w:r>
     </w:p>
     <w:p>
@@ -596,6 +603,7 @@
       <w:r>
         <w:rPr>
           <w:rFonts w:ascii="Times New Roman" w:hAnsi="Times New Roman" w:eastAsia="Times New Roman"/>
+          <w:b w:val="0"/>
           <w:sz w:val="20"/>
         </w:rPr>
         <w:t>Fonte: elaborado pelo autor (2026).</w:t>
@@ -629,9 +637,10 @@
       <w:r>
         <w:rPr>
           <w:rFonts w:ascii="Times New Roman" w:hAnsi="Times New Roman" w:eastAsia="Times New Roman"/>
+          <w:b w:val="0"/>
           <w:sz w:val="24"/>
         </w:rPr>
-        <w:t>A modelagem UML foi utilizada para representar a estrutura est?tica e o comportamento do sistema. Os diagramas a seguir descrevem classes, intera??es, fluxos de atividades e funcionalidades gerais, permitindo compreender de forma organizada os requisitos do software.</w:t>
+        <w:t>A modelagem UML foi utilizada para representar a estrutura estática e o comportamento do sistema. Os diagramas a seguir descrevem classes, interações, fluxos de atividades e funcionalidades gerais, permitindo compreender de forma organizada os requisitos do software.</w:t>
       </w:r>
     </w:p>
     <w:p>
@@ -662,9 +671,10 @@
       <w:r>
         <w:rPr>
           <w:rFonts w:ascii="Times New Roman" w:hAnsi="Times New Roman" w:eastAsia="Times New Roman"/>
+          <w:b w:val="0"/>
           <w:sz w:val="24"/>
         </w:rPr>
-        <w:t>O diagrama de classes demonstra os principais objetos do sistema, seus atributos, responsabilidades e associa??es estruturais.</w:t>
+        <w:t>O diagrama de classes demonstra os principais objetos do sistema, seus atributos, responsabilidades e associações estruturais.</w:t>
       </w:r>
     </w:p>
     <w:p>
@@ -675,9 +685,10 @@
       <w:r>
         <w:rPr>
           <w:rFonts w:ascii="Times New Roman" w:hAnsi="Times New Roman" w:eastAsia="Times New Roman"/>
+          <w:b w:val="0"/>
           <w:sz w:val="20"/>
         </w:rPr>
-        <w:t>Figura 3 - Diagrama de classes do sistema</w:t>
+        <w:t>Figura 3 – Diagrama de classes do sistema</w:t>
       </w:r>
     </w:p>
     <w:p>
@@ -727,6 +738,7 @@
       <w:r>
         <w:rPr>
           <w:rFonts w:ascii="Times New Roman" w:hAnsi="Times New Roman" w:eastAsia="Times New Roman"/>
+          <w:b w:val="0"/>
           <w:sz w:val="20"/>
         </w:rPr>
         <w:t>Fonte: elaborado pelo autor (2026).</w:t>
@@ -760,6 +772,7 @@
       <w:r>
         <w:rPr>
           <w:rFonts w:ascii="Times New Roman" w:hAnsi="Times New Roman" w:eastAsia="Times New Roman"/>
+          <w:b w:val="0"/>
           <w:sz w:val="24"/>
         </w:rPr>
         <w:t>O diagrama de caso de uso apresenta as funcionalidades principais percebidas pelos atores que interagem com o sistema.</w:t>
@@ -773,9 +786,10 @@
       <w:r>
         <w:rPr>
           <w:rFonts w:ascii="Times New Roman" w:hAnsi="Times New Roman" w:eastAsia="Times New Roman"/>
+          <w:b w:val="0"/>
           <w:sz w:val="20"/>
         </w:rPr>
-        <w:t>Figura 4 - Diagrama de caso de uso geral</w:t>
+        <w:t>Figura 4 – Diagrama de caso de uso geral</w:t>
       </w:r>
     </w:p>
     <w:p>
@@ -825,6 +839,7 @@
       <w:r>
         <w:rPr>
           <w:rFonts w:ascii="Times New Roman" w:hAnsi="Times New Roman" w:eastAsia="Times New Roman"/>
+          <w:b w:val="0"/>
           <w:sz w:val="20"/>
         </w:rPr>
         <w:t>Fonte: elaborado pelo autor (2026).</w:t>
@@ -846,7 +861,7 @@
           <w:b/>
           <w:sz w:val="24"/>
         </w:rPr>
-        <w:t>3.3 Diagrama de sequ?ncia do registro de entrada</w:t>
+        <w:t>3.3 Diagrama de sequência do registro de entrada</w:t>
       </w:r>
     </w:p>
     <w:p>
@@ -858,9 +873,10 @@
       <w:r>
         <w:rPr>
           <w:rFonts w:ascii="Times New Roman" w:hAnsi="Times New Roman" w:eastAsia="Times New Roman"/>
+          <w:b w:val="0"/>
           <w:sz w:val="24"/>
         </w:rPr>
-        <w:t>O diagrama de sequ?ncia representa a intera??o temporal entre usu?rio, interface, regras de neg?cio e banco de dados durante o processo de registro de entrada de ve?culos.</w:t>
+        <w:t>O diagrama de sequência representa a interação temporal entre usuário, interface, regras de negócio e banco de dados durante o processo de registro de entrada de veículos.</w:t>
       </w:r>
     </w:p>
     <w:p>
@@ -871,9 +887,10 @@
       <w:r>
         <w:rPr>
           <w:rFonts w:ascii="Times New Roman" w:hAnsi="Times New Roman" w:eastAsia="Times New Roman"/>
+          <w:b w:val="0"/>
           <w:sz w:val="20"/>
         </w:rPr>
-        <w:t>Figura 5 - Diagrama de sequ?ncia do registro de entrada de ve?culo</w:t>
+        <w:t>Figura 5 - Diagrama de sequência do registro de entrada de veículo</w:t>
       </w:r>
     </w:p>
     <w:p>
@@ -923,6 +940,7 @@
       <w:r>
         <w:rPr>
           <w:rFonts w:ascii="Times New Roman" w:hAnsi="Times New Roman" w:eastAsia="Times New Roman"/>
+          <w:b w:val="0"/>
           <w:sz w:val="20"/>
         </w:rPr>
         <w:t>Fonte: elaborado pelo autor (2026).</w:t>
@@ -956,9 +974,10 @@
       <w:r>
         <w:rPr>
           <w:rFonts w:ascii="Times New Roman" w:hAnsi="Times New Roman" w:eastAsia="Times New Roman"/>
+          <w:b w:val="0"/>
           <w:sz w:val="24"/>
         </w:rPr>
-        <w:t>O diagrama de atividades do login descreve o fluxo de autentica??o do usu?rio, incluindo a valida??o de credenciais e o acesso ao sistema.</w:t>
+        <w:t>O diagrama de atividades do login descreve o fluxo de autenticação do usuário, incluindo a validação de credenciais e o acesso ao sistema.</w:t>
       </w:r>
     </w:p>
     <w:p>
@@ -969,9 +988,10 @@
       <w:r>
         <w:rPr>
           <w:rFonts w:ascii="Times New Roman" w:hAnsi="Times New Roman" w:eastAsia="Times New Roman"/>
+          <w:b w:val="0"/>
           <w:sz w:val="20"/>
         </w:rPr>
-        <w:t>Figura 6 - Diagrama de atividades do processo de login</w:t>
+        <w:t>Figura 6 – Diagrama de atividades do processo de login</w:t>
       </w:r>
     </w:p>
     <w:p>
@@ -1021,6 +1041,7 @@
       <w:r>
         <w:rPr>
           <w:rFonts w:ascii="Times New Roman" w:hAnsi="Times New Roman" w:eastAsia="Times New Roman"/>
+          <w:b w:val="0"/>
           <w:sz w:val="20"/>
         </w:rPr>
         <w:t>Fonte: elaborado pelo autor (2026).</w:t>
@@ -1054,9 +1075,10 @@
       <w:r>
         <w:rPr>
           <w:rFonts w:ascii="Times New Roman" w:hAnsi="Times New Roman" w:eastAsia="Times New Roman"/>
+          <w:b w:val="0"/>
           <w:sz w:val="24"/>
         </w:rPr>
-        <w:t>O diagrama de atividades do registro de entrada demonstra o fluxo operacional de cadastro da entrada de um ve?culo no sistema.</w:t>
+        <w:t>O diagrama de atividades do registro de entrada demonstra o fluxo operacional de cadastro da entrada de um veículo no sistema.</w:t>
       </w:r>
     </w:p>
     <w:p>
@@ -1067,9 +1089,10 @@
       <w:r>
         <w:rPr>
           <w:rFonts w:ascii="Times New Roman" w:hAnsi="Times New Roman" w:eastAsia="Times New Roman"/>
+          <w:b w:val="0"/>
           <w:sz w:val="20"/>
         </w:rPr>
-        <w:t>Figura 7 - Diagrama de atividades do registro de entrada</w:t>
+        <w:t>Figura 7 – Diagrama de atividades do registro de entrada</w:t>
       </w:r>
     </w:p>
     <w:p>
@@ -1119,6 +1142,7 @@
       <w:r>
         <w:rPr>
           <w:rFonts w:ascii="Times New Roman" w:hAnsi="Times New Roman" w:eastAsia="Times New Roman"/>
+          <w:b w:val="0"/>
           <w:sz w:val="20"/>
         </w:rPr>
         <w:t>Fonte: elaborado pelo autor (2026).</w:t>
@@ -1140,7 +1164,7 @@
           <w:b/>
           <w:sz w:val="24"/>
         </w:rPr>
-        <w:t>3.6 Diagrama de atividades do registro de sa?da</w:t>
+        <w:t>3.6 Diagrama de atividades do registro de saída</w:t>
       </w:r>
     </w:p>
     <w:p>
@@ -1152,9 +1176,10 @@
       <w:r>
         <w:rPr>
           <w:rFonts w:ascii="Times New Roman" w:hAnsi="Times New Roman" w:eastAsia="Times New Roman"/>
+          <w:b w:val="0"/>
           <w:sz w:val="24"/>
         </w:rPr>
-        <w:t>O diagrama de atividades do registro de sa?da apresenta o fluxo de encerramento da perman?ncia do ve?culo e atualiza??o das informa??es de movimenta??o.</w:t>
+        <w:t>O diagrama de atividades do registro de saída apresenta o fluxo de encerramento da permanência do veículo e atualização das informações de movimentação.</w:t>
       </w:r>
     </w:p>
     <w:p>
@@ -1165,9 +1190,10 @@
       <w:r>
         <w:rPr>
           <w:rFonts w:ascii="Times New Roman" w:hAnsi="Times New Roman" w:eastAsia="Times New Roman"/>
+          <w:b w:val="0"/>
           <w:sz w:val="20"/>
         </w:rPr>
-        <w:t>Figura 8 - Diagrama de atividades do registro de sa?da</w:t>
+        <w:t>Figura 8 – Diagrama de atividades do registro de saída</w:t>
       </w:r>
     </w:p>
     <w:p>
@@ -1217,6 +1243,7 @@
       <w:r>
         <w:rPr>
           <w:rFonts w:ascii="Times New Roman" w:hAnsi="Times New Roman" w:eastAsia="Times New Roman"/>
+          <w:b w:val="0"/>
           <w:sz w:val="20"/>
         </w:rPr>
         <w:t>Fonte: elaborado pelo autor (2026).</w:t>
@@ -1238,7 +1265,7 @@
           <w:b/>
           <w:sz w:val="24"/>
         </w:rPr>
-        <w:t>4 REPOSIT?RIO DO PROJETO NO GITHUB</w:t>
+        <w:t>4 REPOSITÓRIO DO PROJETO NO GITHUB</w:t>
       </w:r>
     </w:p>
     <w:p>
@@ -1250,9 +1277,10 @@
       <w:r>
         <w:rPr>
           <w:rFonts w:ascii="Times New Roman" w:hAnsi="Times New Roman" w:eastAsia="Times New Roman"/>
+          <w:b w:val="0"/>
           <w:sz w:val="24"/>
         </w:rPr>
-        <w:t>Todos os diagramas, documentos e c?digos do projeto foram publicados no reposit?rio GitHub do projeto, conforme solicitado no enunciado da atividade. O reposit?rio re?ne a documenta??o da Entrega 1, os diagramas de banco de dados, os diagramas UML e a estrutura reservada para a implementa??o futura.</w:t>
+        <w:t>Todos os diagramas, documentos e códigos do projeto foram publicados no repositório GitHub do projeto, conforme solicitado no enunciado da atividade. O repositório reúne a documentação da Entrega 1, os diagramas de banco de dados, os diagramas UML e a estrutura reservada para a implementação futura.</w:t>
       </w:r>
     </w:p>
     <w:p>
@@ -1264,9 +1292,10 @@
       <w:r>
         <w:rPr>
           <w:rFonts w:ascii="Times New Roman" w:hAnsi="Times New Roman" w:eastAsia="Times New Roman"/>
+          <w:b w:val="0"/>
           <w:sz w:val="24"/>
         </w:rPr>
-        <w:t>Link do reposit?rio do projeto: https://github.com/rafaeldreyer/sistema-entrada-saida-veiculos</w:t>
+        <w:t>Link do repositório do projeto: https://github.com/rafaeldreyer/sistema-entrada-saida-veiculos</w:t>
       </w:r>
     </w:p>
     <w:p>
@@ -1280,7 +1309,7 @@
           <w:b/>
           <w:sz w:val="24"/>
         </w:rPr>
-        <w:t>5 CONSIDERA??ES FINAIS</w:t>
+        <w:t>5 CONSIDERAÇÕES FINAIS</w:t>
       </w:r>
     </w:p>
     <w:p>
@@ -1292,9 +1321,10 @@
       <w:r>
         <w:rPr>
           <w:rFonts w:ascii="Times New Roman" w:hAnsi="Times New Roman" w:eastAsia="Times New Roman"/>
+          <w:b w:val="0"/>
           <w:sz w:val="24"/>
         </w:rPr>
-        <w:t>A modelagem desenvolvida nesta etapa estabelece uma base consistente para a implementa??o do MVP do sistema de entrada e sa?da de ve?culos. A defini??o das entidades, regras de relacionamento e diagramas UML permite orientar o desenvolvimento do banco de dados e das funcionalidades do sistema, reduzindo ambiguidades e facilitando a evolu??o do projeto nas etapas seguintes.</w:t>
+        <w:t>A modelagem desenvolvida nesta etapa estabelece uma base consistente para a implementação do MVP do sistema de entrada e saída de veículos. A definição das entidades, regras de relacionamento e diagramas UML permite orientar o desenvolvimento do banco de dados e das funcionalidades do sistema, reduzindo ambiguidades e facilitando a evolução do projeto nas etapas seguintes.</w:t>
       </w:r>
     </w:p>
     <w:sectPr>

</xml_diff>